<commit_message>
docs: CLAUDE-3 catalog sync for wave 74 — NODE_PROVISIONING_BOUNDARY doc + docs_chain registration, FOUNDATION_PACKAGES (powergater/edgeheartbeat/resources-accel + multiraft durability note), CHANGELOG wave-74 entry, README pointer; regenerate all exports; docs_chain verify in-sync.
- New canonical doc docs/NODE_PROVISIONING_BOUNDARY.md (HXC-1146) registered in .docs_chain/contexts/tracked_docs.yaml (npbound_md->html/pdf/docx) and pointed to from README docs index.
- FOUNDATION_PACKAGES.md: catalogued pkg/powergater + pkg/edgeheartbeat (Edge) and pkg/resources accelerator extension (GPU/Resource); hardened pkg/multiraft entry with the park-on-persist-error durability behaviour (HXC-917).
- CHANGELOG.md: wave-74 Added block.
- docs_chain sync regenerated exports (npbound + README + FOUNDATION_PACKAGES + CHANGELOG, md->html/pdf/docx); docs_chain verify --all = in-sync. Evidence: qa-results/docs_chain/.

Co-Authored-By: Claude Opus 4.8 <noreply@anthropic.com>
</commit_message>
<xml_diff>
--- a/docs/export/FOUNDATION_PACKAGES.docx
+++ b/docs/export/FOUNDATION_PACKAGES.docx
@@ -573,7 +573,86 @@
               <w:t xml:space="preserve">RaftTransport.SendRead</w:t>
             </w:r>
             <w:r>
-              <w:t xml:space="preserve">; lease expiry re-routes the fast path).</w:t>
+              <w:t xml:space="preserve">; lease expiry re-routes the fast path). Durability-correct Ready loop: a</w:t>
+            </w:r>
+            <w:r>
+              <w:t xml:space="preserve"> </w:t>
+            </w:r>
+            <w:r>
+              <w:rPr>
+                <w:rStyle w:val="VerbatimChar"/>
+              </w:rPr>
+              <w:t xml:space="preserve">ShardStorage</w:t>
+            </w:r>
+            <w:r>
+              <w:t xml:space="preserve"> </w:t>
+            </w:r>
+            <w:r>
+              <w:rPr>
+                <w:rStyle w:val="VerbatimChar"/>
+              </w:rPr>
+              <w:t xml:space="preserve">SetHardState</w:t>
+            </w:r>
+            <w:r>
+              <w:t xml:space="preserve">/</w:t>
+            </w:r>
+            <w:r>
+              <w:rPr>
+                <w:rStyle w:val="VerbatimChar"/>
+              </w:rPr>
+              <w:t xml:space="preserve">Append</w:t>
+            </w:r>
+            <w:r>
+              <w:t xml:space="preserve"> </w:t>
+            </w:r>
+            <w:r>
+              <w:t xml:space="preserve">persistence error</w:t>
+            </w:r>
+            <w:r>
+              <w:t xml:space="preserve"> </w:t>
+            </w:r>
+            <w:r>
+              <w:rPr>
+                <w:b/>
+                <w:bCs/>
+              </w:rPr>
+              <w:t xml:space="preserve">parks</w:t>
+            </w:r>
+            <w:r>
+              <w:t xml:space="preserve"> </w:t>
+            </w:r>
+            <w:r>
+              <w:t xml:space="preserve">the un-persisted</w:t>
+            </w:r>
+            <w:r>
+              <w:t xml:space="preserve"> </w:t>
+            </w:r>
+            <w:r>
+              <w:rPr>
+                <w:rStyle w:val="VerbatimChar"/>
+              </w:rPr>
+              <w:t xml:space="preserve">Ready</w:t>
+            </w:r>
+            <w:r>
+              <w:t xml:space="preserve"> </w:t>
+            </w:r>
+            <w:r>
+              <w:t xml:space="preserve">and skips</w:t>
+            </w:r>
+            <w:r>
+              <w:t xml:space="preserve"> </w:t>
+            </w:r>
+            <w:r>
+              <w:rPr>
+                <w:rStyle w:val="VerbatimChar"/>
+              </w:rPr>
+              <w:t xml:space="preserve">Advance</w:t>
+            </w:r>
+            <w:r>
+              <w:t xml:space="preserve"> </w:t>
+            </w:r>
+            <w:r>
+              <w:t xml:space="preserve">so raft re-presents it (never falsely marking it durably handled) (HXC-917).</w:t>
             </w:r>
           </w:p>
         </w:tc>
@@ -1913,6 +1992,75 @@
               <w:rPr>
                 <w:rStyle w:val="VerbatimChar"/>
               </w:rPr>
+              <w:t xml:space="preserve">resources</w:t>
+            </w:r>
+          </w:p>
+        </w:tc>
+        <w:tc>
+          <w:tcPr/>
+          <w:p>
+            <w:pPr>
+              <w:pStyle w:val="Compact"/>
+            </w:pPr>
+            <w:r>
+              <w:t xml:space="preserve">Node resource probe (CPU/mem/disk/net/GPU) extended with accelerator reporting:</w:t>
+            </w:r>
+            <w:r>
+              <w:t xml:space="preserve"> </w:t>
+            </w:r>
+            <w:r>
+              <w:rPr>
+                <w:rStyle w:val="VerbatimChar"/>
+              </w:rPr>
+              <w:t xml:space="preserve">GPUInfo.TFLOPS</w:t>
+            </w:r>
+            <w:r>
+              <w:t xml:space="preserve"> </w:t>
+            </w:r>
+            <w:r>
+              <w:t xml:space="preserve">+</w:t>
+            </w:r>
+            <w:r>
+              <w:t xml:space="preserve"> </w:t>
+            </w:r>
+            <w:r>
+              <w:rPr>
+                <w:rStyle w:val="VerbatimChar"/>
+              </w:rPr>
+              <w:t xml:space="preserve">Accelerators{NPUTops,FPGALogicElements,QPUPresent}</w:t>
+            </w:r>
+            <w:r>
+              <w:t xml:space="preserve">. Real per-OS probe (darwin Apple-GPU TFLOPS from</w:t>
+            </w:r>
+            <w:r>
+              <w:t xml:space="preserve"> </w:t>
+            </w:r>
+            <w:r>
+              <w:rPr>
+                <w:rStyle w:val="VerbatimChar"/>
+              </w:rPr>
+              <w:t xml:space="preserve">system_profiler</w:t>
+            </w:r>
+            <w:r>
+              <w:t xml:space="preserve"> </w:t>
+            </w:r>
+            <w:r>
+              <w:t xml:space="preserve">core count; linux sysfs PCI-identity catalog) with an operator override-label fallback for non-self-probeable NPU/FPGA/QPU (HXC-1300).</w:t>
+            </w:r>
+          </w:p>
+        </w:tc>
+      </w:tr>
+      <w:tr>
+        <w:tc>
+          <w:tcPr/>
+          <w:p>
+            <w:pPr>
+              <w:pStyle w:val="Compact"/>
+            </w:pPr>
+            <w:r>
+              <w:rPr>
+                <w:rStyle w:val="VerbatimChar"/>
+              </w:rPr>
               <w:t xml:space="preserve">local</w:t>
             </w:r>
           </w:p>
@@ -3536,6 +3684,222 @@
             </w:pPr>
             <w:r>
               <w:t xml:space="preserve">Edge data fusion.</w:t>
+            </w:r>
+          </w:p>
+        </w:tc>
+      </w:tr>
+      <w:tr>
+        <w:tc>
+          <w:tcPr/>
+          <w:p>
+            <w:pPr>
+              <w:pStyle w:val="Compact"/>
+            </w:pPr>
+            <w:r>
+              <w:rPr>
+                <w:rStyle w:val="VerbatimChar"/>
+              </w:rPr>
+              <w:t xml:space="preserve">edgeheartbeat</w:t>
+            </w:r>
+          </w:p>
+        </w:tc>
+        <w:tc>
+          <w:tcPr/>
+          <w:p>
+            <w:pPr>
+              <w:pStyle w:val="Compact"/>
+            </w:pPr>
+            <w:r>
+              <w:t xml:space="preserve">Edge heartbeat carrying battery%/charging/CPU-temp/network-type with a churn-tolerant collector that marks a device offline past a configurable timeout; real per-OS</w:t>
+            </w:r>
+            <w:r>
+              <w:t xml:space="preserve"> </w:t>
+            </w:r>
+            <w:r>
+              <w:rPr>
+                <w:rStyle w:val="VerbatimChar"/>
+              </w:rPr>
+              <w:t xml:space="preserve">TelemetrySource</w:t>
+            </w:r>
+            <w:r>
+              <w:t xml:space="preserve"> </w:t>
+            </w:r>
+            <w:r>
+              <w:t xml:space="preserve">(darwin</w:t>
+            </w:r>
+            <w:r>
+              <w:t xml:space="preserve"> </w:t>
+            </w:r>
+            <w:r>
+              <w:rPr>
+                <w:rStyle w:val="VerbatimChar"/>
+              </w:rPr>
+              <w:t xml:space="preserve">pmset</w:t>
+            </w:r>
+            <w:r>
+              <w:t xml:space="preserve">/</w:t>
+            </w:r>
+            <w:r>
+              <w:rPr>
+                <w:rStyle w:val="VerbatimChar"/>
+              </w:rPr>
+              <w:t xml:space="preserve">sysctl</w:t>
+            </w:r>
+            <w:r>
+              <w:t xml:space="preserve">, linux</w:t>
+            </w:r>
+            <w:r>
+              <w:t xml:space="preserve"> </w:t>
+            </w:r>
+            <w:r>
+              <w:rPr>
+                <w:rStyle w:val="VerbatimChar"/>
+              </w:rPr>
+              <w:t xml:space="preserve">/sys</w:t>
+            </w:r>
+            <w:r>
+              <w:t xml:space="preserve">+</w:t>
+            </w:r>
+            <w:r>
+              <w:rPr>
+                <w:rStyle w:val="VerbatimChar"/>
+              </w:rPr>
+              <w:t xml:space="preserve">/proc/net</w:t>
+            </w:r>
+            <w:r>
+              <w:t xml:space="preserve">) behind one interface, injected clock, validated over a real loopback transport (HXC-1185).</w:t>
+            </w:r>
+          </w:p>
+        </w:tc>
+      </w:tr>
+      <w:tr>
+        <w:tc>
+          <w:tcPr/>
+          <w:p>
+            <w:pPr>
+              <w:pStyle w:val="Compact"/>
+            </w:pPr>
+            <w:r>
+              <w:rPr>
+                <w:rStyle w:val="VerbatimChar"/>
+              </w:rPr>
+              <w:t xml:space="preserve">powergater</w:t>
+            </w:r>
+          </w:p>
+        </w:tc>
+        <w:tc>
+          <w:tcPr/>
+          <w:p>
+            <w:pPr>
+              <w:pStyle w:val="Compact"/>
+            </w:pPr>
+            <w:r>
+              <w:t xml:space="preserve">Charging-gated work-acceptance guard:</w:t>
+            </w:r>
+            <w:r>
+              <w:t xml:space="preserve"> </w:t>
+            </w:r>
+            <w:r>
+              <w:rPr>
+                <w:rStyle w:val="VerbatimChar"/>
+              </w:rPr>
+              <w:t xml:space="preserve">CanAcceptWork() (bool, reason)</w:t>
+            </w:r>
+            <w:r>
+              <w:t xml:space="preserve"> </w:t>
+            </w:r>
+            <w:r>
+              <w:t xml:space="preserve">returning</w:t>
+            </w:r>
+            <w:r>
+              <w:t xml:space="preserve"> </w:t>
+            </w:r>
+            <w:r>
+              <w:rPr>
+                <w:rStyle w:val="VerbatimChar"/>
+              </w:rPr>
+              <w:t xml:space="preserve">not_charging</w:t>
+            </w:r>
+            <w:r>
+              <w:t xml:space="preserve">/</w:t>
+            </w:r>
+            <w:r>
+              <w:rPr>
+                <w:rStyle w:val="VerbatimChar"/>
+              </w:rPr>
+              <w:t xml:space="preserve">battery_low_X%</w:t>
+            </w:r>
+            <w:r>
+              <w:t xml:space="preserve">/</w:t>
+            </w:r>
+            <w:r>
+              <w:rPr>
+                <w:rStyle w:val="VerbatimChar"/>
+              </w:rPr>
+              <w:t xml:space="preserve">daytime</w:t>
+            </w:r>
+            <w:r>
+              <w:t xml:space="preserve">/</w:t>
+            </w:r>
+            <w:r>
+              <w:rPr>
+                <w:rStyle w:val="VerbatimChar"/>
+              </w:rPr>
+              <w:t xml:space="preserve">cpu_hot_XC</w:t>
+            </w:r>
+            <w:r>
+              <w:t xml:space="preserve"> </w:t>
+            </w:r>
+            <w:r>
+              <w:t xml:space="preserve">from a real per-OS</w:t>
+            </w:r>
+            <w:r>
+              <w:t xml:space="preserve"> </w:t>
+            </w:r>
+            <w:r>
+              <w:rPr>
+                <w:rStyle w:val="VerbatimChar"/>
+              </w:rPr>
+              <w:t xml:space="preserve">PowerSource</w:t>
+            </w:r>
+            <w:r>
+              <w:t xml:space="preserve"> </w:t>
+            </w:r>
+            <w:r>
+              <w:t xml:space="preserve">(darwin</w:t>
+            </w:r>
+            <w:r>
+              <w:t xml:space="preserve"> </w:t>
+            </w:r>
+            <w:r>
+              <w:rPr>
+                <w:rStyle w:val="VerbatimChar"/>
+              </w:rPr>
+              <w:t xml:space="preserve">pmset</w:t>
+            </w:r>
+            <w:r>
+              <w:t xml:space="preserve">, linux</w:t>
+            </w:r>
+            <w:r>
+              <w:t xml:space="preserve"> </w:t>
+            </w:r>
+            <w:r>
+              <w:rPr>
+                <w:rStyle w:val="VerbatimChar"/>
+              </w:rPr>
+              <w:t xml:space="preserve">/sys/class/power_supply</w:t>
+            </w:r>
+            <w:r>
+              <w:t xml:space="preserve">+</w:t>
+            </w:r>
+            <w:r>
+              <w:rPr>
+                <w:rStyle w:val="VerbatimChar"/>
+              </w:rPr>
+              <w:t xml:space="preserve">thermal</w:t>
+            </w:r>
+            <w:r>
+              <w:t xml:space="preserve">) behind one interface (HXC-1175).</w:t>
             </w:r>
           </w:p>
         </w:tc>

</xml_diff>

<commit_message>
docs: CLAUDE-3 catalog sync for wave 75 — phase_02 architecture guide + docs_chain registration, FOUNDATION_PACKAGES (runpod lock-release/EndpointOf + Akash SDL-injection/rep-gate hardening), CHANGELOG wave-75 entry, README pointer; regenerate all exports; docs_chain verify in-sync.
- New canonical doc docs/guides/phase_02_architecture.md (HXC-1164) with a Mermaid console->mesh->scheduler->node diagram, registered in .docs_chain/contexts/tracked_docs.yaml (ph02arch_md->html/pdf/docx) and pointed to from README.
- FOUNDATION_PACKAGES.md: provider/runpod + marketplaceadapter entries updated with the wave-75 behaviour (lock-release across ColdProvision, EndpointOf, yamlQuote SDL encoding, reputation-gate clamp).
- CHANGELOG.md: wave-75 Added block. docs_chain sync regenerated exports; docs_chain verify --all = in-sync. Evidence: qa-results/docs_chain/.

Co-Authored-By: Claude Opus 4.8 <noreply@anthropic.com>
</commit_message>
<xml_diff>
--- a/docs/export/FOUNDATION_PACKAGES.docx
+++ b/docs/export/FOUNDATION_PACKAGES.docx
@@ -5113,6 +5113,66 @@
             <w:r>
               <w:t xml:space="preserve">) with a warm-pool fast path (pre-warmed instances served before cold provisioning) over an injectable client.</w:t>
             </w:r>
+            <w:r>
+              <w:t xml:space="preserve"> </w:t>
+            </w:r>
+            <w:r>
+              <w:rPr>
+                <w:rStyle w:val="VerbatimChar"/>
+              </w:rPr>
+              <w:t xml:space="preserve">Provision</w:t>
+            </w:r>
+            <w:r>
+              <w:t xml:space="preserve"> </w:t>
+            </w:r>
+            <w:r>
+              <w:t xml:space="preserve">releases the mutex across the</w:t>
+            </w:r>
+            <w:r>
+              <w:t xml:space="preserve"> </w:t>
+            </w:r>
+            <w:r>
+              <w:rPr>
+                <w:rStyle w:val="VerbatimChar"/>
+              </w:rPr>
+              <w:t xml:space="preserve">ColdProvision</w:t>
+            </w:r>
+            <w:r>
+              <w:t xml:space="preserve"> </w:t>
+            </w:r>
+            <w:r>
+              <w:t xml:space="preserve">RPC (reserve-slot → unlock → RPC → relock → record/rollback) so concurrent cold provisions overlap while a</w:t>
+            </w:r>
+            <w:r>
+              <w:t xml:space="preserve"> </w:t>
+            </w:r>
+            <w:r>
+              <w:rPr>
+                <w:rStyle w:val="VerbatimChar"/>
+              </w:rPr>
+              <w:t xml:space="preserve">reserved</w:t>
+            </w:r>
+            <w:r>
+              <w:t xml:space="preserve"> </w:t>
+            </w:r>
+            <w:r>
+              <w:t xml:space="preserve">counter keeps capacity correct;</w:t>
+            </w:r>
+            <w:r>
+              <w:t xml:space="preserve"> </w:t>
+            </w:r>
+            <w:r>
+              <w:rPr>
+                <w:rStyle w:val="VerbatimChar"/>
+              </w:rPr>
+              <w:t xml:space="preserve">EndpointOf(id)</w:t>
+            </w:r>
+            <w:r>
+              <w:t xml:space="preserve"> </w:t>
+            </w:r>
+            <w:r>
+              <w:t xml:space="preserve">exposes the reachable worker endpoint (HXC-919).</w:t>
+            </w:r>
           </w:p>
         </w:tc>
       </w:tr>
@@ -5463,6 +5523,75 @@
             </w:r>
             <w:r>
               <w:t xml:space="preserve">(Cosmos/AKT reverse-auction pricing, SDL submission, provider-reputation gate) over an injectable client; routes work to the named marketplace.</w:t>
+            </w:r>
+            <w:r>
+              <w:t xml:space="preserve"> </w:t>
+            </w:r>
+            <w:r>
+              <w:rPr>
+                <w:rStyle w:val="VerbatimChar"/>
+              </w:rPr>
+              <w:t xml:space="preserve">buildSDL</w:t>
+            </w:r>
+            <w:r>
+              <w:t xml:space="preserve"> </w:t>
+            </w:r>
+            <w:r>
+              <w:t xml:space="preserve">YAML-double-quote-encodes caller-controlled</w:t>
+            </w:r>
+            <w:r>
+              <w:t xml:space="preserve"> </w:t>
+            </w:r>
+            <w:r>
+              <w:rPr>
+                <w:rStyle w:val="VerbatimChar"/>
+              </w:rPr>
+              <w:t xml:space="preserve">WorkSpec</w:t>
+            </w:r>
+            <w:r>
+              <w:t xml:space="preserve"> </w:t>
+            </w:r>
+            <w:r>
+              <w:t xml:space="preserve">fields (</w:t>
+            </w:r>
+            <w:r>
+              <w:rPr>
+                <w:rStyle w:val="VerbatimChar"/>
+              </w:rPr>
+              <w:t xml:space="preserve">yamlQuote</w:t>
+            </w:r>
+            <w:r>
+              <w:t xml:space="preserve">) so a crafted value cannot inject manifest structure, and the reputation gate clamps a non-positive</w:t>
+            </w:r>
+            <w:r>
+              <w:t xml:space="preserve"> </w:t>
+            </w:r>
+            <w:r>
+              <w:rPr>
+                <w:rStyle w:val="VerbatimChar"/>
+              </w:rPr>
+              <w:t xml:space="preserve">MinReputation</w:t>
+            </w:r>
+            <w:r>
+              <w:t xml:space="preserve"> </w:t>
+            </w:r>
+            <w:r>
+              <w:t xml:space="preserve">to a 0.5 safe floor so a zero-value</w:t>
+            </w:r>
+            <w:r>
+              <w:t xml:space="preserve"> </w:t>
+            </w:r>
+            <w:r>
+              <w:rPr>
+                <w:rStyle w:val="VerbatimChar"/>
+              </w:rPr>
+              <w:t xml:space="preserve">AkashAdapter{}</w:t>
+            </w:r>
+            <w:r>
+              <w:t xml:space="preserve"> </w:t>
+            </w:r>
+            <w:r>
+              <w:t xml:space="preserve">cannot admit everyone (HXC-918).</w:t>
             </w:r>
           </w:p>
         </w:tc>

</xml_diff>

<commit_message>
docs: CLAUDE-3 catalog sync for waves 76+77 — CHANGELOG + FOUNDATION_PACKAGES (gpu/benchmark/tierdetect + cloudspot IMDS) + README pointers (MVP_ARCHITECTURE, new pkgs); regenerate all exports; docs_chain verify in-sync
- CHANGELOG: waves 76+77 entry (8 streams, gating recipe).
- FOUNDATION_PACKAGES: +`gpu`/`benchmark`/`tierdetect` rows, cloudspot IMDS-poller
  detail, package count 126+→129+.
- README: new packages in the GPU & resource-mgmt / Burst & economics rows,
  cloudspot IMDS detail, and a docs pointer to docs/MVP_ARCHITECTURE.md.
- docs_chain sync --all regenerated md→html/pdf/docx exports for changelog /
  foundation / readme / mvp; docs_chain verify --all reports in-sync (evidence
  qa-results/docs_chain/<run-id>/). MVP_ARCHITECTURE.md (HXC-1145) now tracked.

Co-Authored-By: Claude Opus 4.8 <noreply@anthropic.com>
</commit_message>
<xml_diff>
--- a/docs/export/FOUNDATION_PACKAGES.docx
+++ b/docs/export/FOUNDATION_PACKAGES.docx
@@ -43,7 +43,7 @@
           <w:b/>
           <w:bCs/>
         </w:rPr>
-        <w:t xml:space="preserve">126+ packages</w:t>
+        <w:t xml:space="preserve">129+ packages</w:t>
       </w:r>
       <w:r>
         <w:t xml:space="preserve"> </w:t>
@@ -2464,6 +2464,75 @@
             <w:r>
               <w:t xml:space="preserve">Burst-to-cloud autoscaling, spot pricing, and compute marketplace.</w:t>
             </w:r>
+            <w:r>
+              <w:t xml:space="preserve"> </w:t>
+            </w:r>
+            <w:r>
+              <w:rPr>
+                <w:rStyle w:val="VerbatimChar"/>
+              </w:rPr>
+              <w:t xml:space="preserve">cloudspot</w:t>
+            </w:r>
+            <w:r>
+              <w:t xml:space="preserve"> </w:t>
+            </w:r>
+            <w:r>
+              <w:t xml:space="preserve">includes real AWS IMDSv2 (token</w:t>
+            </w:r>
+            <w:r>
+              <w:t xml:space="preserve"> </w:t>
+            </w:r>
+            <w:r>
+              <w:rPr>
+                <w:rStyle w:val="VerbatimChar"/>
+              </w:rPr>
+              <w:t xml:space="preserve">PUT</w:t>
+            </w:r>
+            <w:r>
+              <w:t xml:space="preserve">→authenticated</w:t>
+            </w:r>
+            <w:r>
+              <w:t xml:space="preserve"> </w:t>
+            </w:r>
+            <w:r>
+              <w:rPr>
+                <w:rStyle w:val="VerbatimChar"/>
+              </w:rPr>
+              <w:t xml:space="preserve">GET</w:t>
+            </w:r>
+            <w:r>
+              <w:t xml:space="preserve"> </w:t>
+            </w:r>
+            <w:r>
+              <w:t xml:space="preserve">instance-action), Azure scheduled-events, and GCP preemption interruption pollers (genuine token-dance wire protocol,</w:t>
+            </w:r>
+            <w:r>
+              <w:t xml:space="preserve"> </w:t>
+            </w:r>
+            <w:r>
+              <w:rPr>
+                <w:rStyle w:val="VerbatimChar"/>
+              </w:rPr>
+              <w:t xml:space="preserve">httptest</w:t>
+            </w:r>
+            <w:r>
+              <w:t xml:space="preserve">-proven) driving</w:t>
+            </w:r>
+            <w:r>
+              <w:t xml:space="preserve"> </w:t>
+            </w:r>
+            <w:r>
+              <w:rPr>
+                <w:rStyle w:val="VerbatimChar"/>
+              </w:rPr>
+              <w:t xml:space="preserve">drain→checkpoint→upload</w:t>
+            </w:r>
+            <w:r>
+              <w:t xml:space="preserve"> </w:t>
+            </w:r>
+            <w:r>
+              <w:t xml:space="preserve">via an injectable sink (HXC-1328; live cloud HXC-1617).</w:t>
+            </w:r>
           </w:p>
         </w:tc>
       </w:tr>
@@ -2811,6 +2880,204 @@
             </w:r>
             <w:r>
               <w:t xml:space="preserve">), atomically applies fingerprints, allocates by request, and rejects oversubscription beyond reported device count.</w:t>
+            </w:r>
+          </w:p>
+        </w:tc>
+      </w:tr>
+      <w:tr>
+        <w:tc>
+          <w:tcPr/>
+          <w:p>
+            <w:pPr>
+              <w:pStyle w:val="Compact"/>
+            </w:pPr>
+            <w:r>
+              <w:rPr>
+                <w:rStyle w:val="VerbatimChar"/>
+              </w:rPr>
+              <w:t xml:space="preserve">gpu</w:t>
+            </w:r>
+          </w:p>
+        </w:tc>
+        <w:tc>
+          <w:tcPr/>
+          <w:p>
+            <w:pPr>
+              <w:pStyle w:val="Compact"/>
+            </w:pPr>
+            <w:r>
+              <w:rPr>
+                <w:rStyle w:val="VerbatimChar"/>
+              </w:rPr>
+              <w:t xml:space="preserve">ProviderAdapter</w:t>
+            </w:r>
+            <w:r>
+              <w:t xml:space="preserve"> </w:t>
+            </w:r>
+            <w:r>
+              <w:t xml:space="preserve">registration hooks: a thread-safe registry (</w:t>
+            </w:r>
+            <w:r>
+              <w:rPr>
+                <w:rStyle w:val="VerbatimChar"/>
+              </w:rPr>
+              <w:t xml:space="preserve">Register</w:t>
+            </w:r>
+            <w:r>
+              <w:t xml:space="preserve">/</w:t>
+            </w:r>
+            <w:r>
+              <w:rPr>
+                <w:rStyle w:val="VerbatimChar"/>
+              </w:rPr>
+              <w:t xml:space="preserve">List</w:t>
+            </w:r>
+            <w:r>
+              <w:t xml:space="preserve">/</w:t>
+            </w:r>
+            <w:r>
+              <w:rPr>
+                <w:rStyle w:val="VerbatimChar"/>
+              </w:rPr>
+              <w:t xml:space="preserve">Get</w:t>
+            </w:r>
+            <w:r>
+              <w:t xml:space="preserve">/</w:t>
+            </w:r>
+            <w:r>
+              <w:rPr>
+                <w:rStyle w:val="VerbatimChar"/>
+              </w:rPr>
+              <w:t xml:space="preserve">Lookup</w:t>
+            </w:r>
+            <w:r>
+              <w:t xml:space="preserve">, duplicate-name guarded, race-free under</w:t>
+            </w:r>
+            <w:r>
+              <w:t xml:space="preserve"> </w:t>
+            </w:r>
+            <w:r>
+              <w:rPr>
+                <w:rStyle w:val="VerbatimChar"/>
+              </w:rPr>
+              <w:t xml:space="preserve">-race</w:t>
+            </w:r>
+            <w:r>
+              <w:t xml:space="preserve">) exposing a pool-facing provider listing so a new external provider adapter plugs into the GPU layer (HXC-1533; pool consumption HXC-1615).</w:t>
+            </w:r>
+          </w:p>
+        </w:tc>
+      </w:tr>
+      <w:tr>
+        <w:tc>
+          <w:tcPr/>
+          <w:p>
+            <w:pPr>
+              <w:pStyle w:val="Compact"/>
+            </w:pPr>
+            <w:r>
+              <w:rPr>
+                <w:rStyle w:val="VerbatimChar"/>
+              </w:rPr>
+              <w:t xml:space="preserve">benchmark</w:t>
+            </w:r>
+          </w:p>
+        </w:tc>
+        <w:tc>
+          <w:tcPr/>
+          <w:p>
+            <w:pPr>
+              <w:pStyle w:val="Compact"/>
+            </w:pPr>
+            <w:r>
+              <w:t xml:space="preserve">Micro-benchmarker producing a real, repeatable normalized on-host CPU score (+ typed GPU TFLOPS / NPU TOPS seams) for tier assignment / scheduling hints; repeatability asserted within a coefficient-of-variation tolerance band (HXC-1308).</w:t>
+            </w:r>
+          </w:p>
+        </w:tc>
+      </w:tr>
+      <w:tr>
+        <w:tc>
+          <w:tcPr/>
+          <w:p>
+            <w:pPr>
+              <w:pStyle w:val="Compact"/>
+            </w:pPr>
+            <w:r>
+              <w:rPr>
+                <w:rStyle w:val="VerbatimChar"/>
+              </w:rPr>
+              <w:t xml:space="preserve">tierdetect</w:t>
+            </w:r>
+          </w:p>
+        </w:tc>
+        <w:tc>
+          <w:tcPr/>
+          <w:p>
+            <w:pPr>
+              <w:pStyle w:val="Compact"/>
+            </w:pPr>
+            <w:r>
+              <w:t xml:space="preserve">Pre-provision host-capability gate: real cross-platform detection (darwin</w:t>
+            </w:r>
+            <w:r>
+              <w:t xml:space="preserve"> </w:t>
+            </w:r>
+            <w:r>
+              <w:rPr>
+                <w:rStyle w:val="VerbatimChar"/>
+              </w:rPr>
+              <w:t xml:space="preserve">sysctl</w:t>
+            </w:r>
+            <w:r>
+              <w:t xml:space="preserve">/arch + linux</w:t>
+            </w:r>
+            <w:r>
+              <w:t xml:space="preserve"> </w:t>
+            </w:r>
+            <w:r>
+              <w:rPr>
+                <w:rStyle w:val="VerbatimChar"/>
+              </w:rPr>
+              <w:t xml:space="preserve">/dev/kvm</w:t>
+            </w:r>
+            <w:r>
+              <w:t xml:space="preserve">,</w:t>
+            </w:r>
+            <w:r>
+              <w:rPr>
+                <w:rStyle w:val="VerbatimChar"/>
+              </w:rPr>
+              <w:t xml:space="preserve">/proc</w:t>
+            </w:r>
+            <w:r>
+              <w:t xml:space="preserve">,</w:t>
+            </w:r>
+            <w:r>
+              <w:rPr>
+                <w:rStyle w:val="VerbatimChar"/>
+              </w:rPr>
+              <w:t xml:space="preserve">binfmt</w:t>
+            </w:r>
+            <w:r>
+              <w:t xml:space="preserve"> </w:t>
+            </w:r>
+            <w:r>
+              <w:t xml:space="preserve">behind one build-tagged interface) returning a typed</w:t>
+            </w:r>
+            <w:r>
+              <w:t xml:space="preserve"> </w:t>
+            </w:r>
+            <w:r>
+              <w:rPr>
+                <w:rStyle w:val="VerbatimChar"/>
+              </w:rPr>
+              <w:t xml:space="preserve">MissingCapabilityError</w:t>
+            </w:r>
+            <w:r>
+              <w:t xml:space="preserve"> </w:t>
+            </w:r>
+            <w:r>
+              <w:t xml:space="preserve">when a requested tier’s needs are unmet (HXC-1230).</w:t>
             </w:r>
           </w:p>
         </w:tc>

</xml_diff>

<commit_message>
docs: CLAUDE-3 catalog sync for wave 79 — CHANGELOG + FOUNDATION_PACKAGES (multiraft OnPersistError); regenerate exports; docs_chain verify in-sync
- CHANGELOG.md: wave-79 Added entry (HXC-927 multiraft public persist-error hook,
  HXC-1616 cloudspot GCP/Azure WithClock honored).
- docs/FOUNDATION_PACKAGES.md: multiraft row notes the OnPersistError/LastPersistError seam.
- docs/export/*: regenerated CHANGELOG + FOUNDATION_PACKAGES html/pdf/docx.
- docs_chain sync --all then verify --all => in-sync.

Co-Authored-By: Claude Opus 4.8 <noreply@anthropic.com>
</commit_message>
<xml_diff>
--- a/docs/export/FOUNDATION_PACKAGES.docx
+++ b/docs/export/FOUNDATION_PACKAGES.docx
@@ -652,7 +652,37 @@
               <w:t xml:space="preserve"> </w:t>
             </w:r>
             <w:r>
-              <w:t xml:space="preserve">so raft re-presents it (never falsely marking it durably handled) (HXC-917).</w:t>
+              <w:t xml:space="preserve">so raft re-presents it (never falsely marking it durably handled) (HXC-917); the persist-error is also surfaced through a public observability seam — a registerable</w:t>
+            </w:r>
+            <w:r>
+              <w:t xml:space="preserve"> </w:t>
+            </w:r>
+            <w:r>
+              <w:rPr>
+                <w:rStyle w:val="VerbatimChar"/>
+              </w:rPr>
+              <w:t xml:space="preserve">OnPersistError</w:t>
+            </w:r>
+            <w:r>
+              <w:t xml:space="preserve"> </w:t>
+            </w:r>
+            <w:r>
+              <w:t xml:space="preserve">hook +</w:t>
+            </w:r>
+            <w:r>
+              <w:t xml:space="preserve"> </w:t>
+            </w:r>
+            <w:r>
+              <w:rPr>
+                <w:rStyle w:val="VerbatimChar"/>
+              </w:rPr>
+              <w:t xml:space="preserve">LastPersistError</w:t>
+            </w:r>
+            <w:r>
+              <w:t xml:space="preserve"> </w:t>
+            </w:r>
+            <w:r>
+              <w:t xml:space="preserve">accessor fire with the shard id + error, nil hook = unchanged behavior (HXC-927).</w:t>
             </w:r>
           </w:p>
         </w:tc>

</xml_diff>

<commit_message>
docs: CLAUDE-3 catalog sync for wave 80 — CHANGELOG + FOUNDATION_PACKAGES (pkg/events Avro codec); regenerate exports; docs_chain verify in-sync
- CHANGELOG.md: wave-80 Added entry (HXC-1119 Avro-subset codec, single-object
  framing, schema-validated routing, writer/reader resolution + evolution).
- docs/FOUNDATION_PACKAGES.md: dedicated events (Avro) row under Messaging.
- docs/export/*: regenerated CHANGELOG + FOUNDATION_PACKAGES html/pdf/docx.
- docs_chain sync --all then verify --all => in-sync.

Co-Authored-By: Claude Opus 4.8 <noreply@anthropic.com>
</commit_message>
<xml_diff>
--- a/docs/export/FOUNDATION_PACKAGES.docx
+++ b/docs/export/FOUNDATION_PACKAGES.docx
@@ -3824,6 +3824,81 @@
             </w:pPr>
             <w:r>
               <w:t xml:space="preserve">Framed transport, pub/sub, events, serialization.</w:t>
+            </w:r>
+          </w:p>
+        </w:tc>
+      </w:tr>
+      <w:tr>
+        <w:tc>
+          <w:tcPr/>
+          <w:p>
+            <w:pPr>
+              <w:pStyle w:val="Compact"/>
+            </w:pPr>
+            <w:r>
+              <w:rPr>
+                <w:rStyle w:val="VerbatimChar"/>
+              </w:rPr>
+              <w:t xml:space="preserve">events</w:t>
+            </w:r>
+            <w:r>
+              <w:t xml:space="preserve"> </w:t>
+            </w:r>
+            <w:r>
+              <w:t xml:space="preserve">(Avro)</w:t>
+            </w:r>
+          </w:p>
+        </w:tc>
+        <w:tc>
+          <w:tcPr/>
+          <w:p>
+            <w:pPr>
+              <w:pStyle w:val="Compact"/>
+            </w:pPr>
+            <w:r>
+              <w:t xml:space="preserve">Stdlib-only Avro-subset codec for domain events: flat primitive records, spec-faithful binary encoding (zig-zag varint, LE-IEEE-754 double), single-object framing (</w:t>
+            </w:r>
+            <w:r>
+              <w:rPr>
+                <w:rStyle w:val="VerbatimChar"/>
+              </w:rPr>
+              <w:t xml:space="preserve">0xC3 0x01</w:t>
+            </w:r>
+            <w:r>
+              <w:t xml:space="preserve"> </w:t>
+            </w:r>
+            <w:r>
+              <w:t xml:space="preserve">+ CRC-64-AVRO fingerprint) so payloads are self-describing, a</w:t>
+            </w:r>
+            <w:r>
+              <w:t xml:space="preserve"> </w:t>
+            </w:r>
+            <w:r>
+              <w:rPr>
+                <w:rStyle w:val="VerbatimChar"/>
+              </w:rPr>
+              <w:t xml:space="preserve">SchemaRegistry</w:t>
+            </w:r>
+            <w:r>
+              <w:t xml:space="preserve"> </w:t>
+            </w:r>
+            <w:r>
+              <w:t xml:space="preserve">for schema-VALIDATED routing (unknown fingerprint rejected), and writer→reader schema RESOLUTION enabling backward+forward-compatible evolution (defaulted fields fill reader-only, writer-only fields skip).</w:t>
+            </w:r>
+            <w:r>
+              <w:t xml:space="preserve"> </w:t>
+            </w:r>
+            <w:r>
+              <w:rPr>
+                <w:rStyle w:val="VerbatimChar"/>
+              </w:rPr>
+              <w:t xml:space="preserve">NodeEventSchemaV1/V2</w:t>
+            </w:r>
+            <w:r>
+              <w:t xml:space="preserve"> </w:t>
+            </w:r>
+            <w:r>
+              <w:t xml:space="preserve">evolution round-trips both directions (HXC-1119).</w:t>
             </w:r>
           </w:p>
         </w:tc>

</xml_diff>

<commit_message>
docs: CLAUDE-3 catalog sync for wave 82 — CHANGELOG + FOUNDATION_PACKAGES (events Avro live-NATS wire path); regenerate exports; docs_chain verify in-sync
Co-Authored-By: Claude Opus 4.8 <noreply@anthropic.com>
</commit_message>
<xml_diff>
--- a/docs/export/FOUNDATION_PACKAGES.docx
+++ b/docs/export/FOUNDATION_PACKAGES.docx
@@ -3898,7 +3898,64 @@
               <w:t xml:space="preserve"> </w:t>
             </w:r>
             <w:r>
-              <w:t xml:space="preserve">evolution round-trips both directions (HXC-1119).</w:t>
+              <w:t xml:space="preserve">evolution round-trips both directions (HXC-1119). Wired into the live</w:t>
+            </w:r>
+            <w:r>
+              <w:t xml:space="preserve"> </w:t>
+            </w:r>
+            <w:r>
+              <w:rPr>
+                <w:rStyle w:val="VerbatimChar"/>
+              </w:rPr>
+              <w:t xml:space="preserve">NATSBackend</w:t>
+            </w:r>
+            <w:r>
+              <w:t xml:space="preserve"> </w:t>
+            </w:r>
+            <w:r>
+              <w:t xml:space="preserve">wire path (</w:t>
+            </w:r>
+            <w:r>
+              <w:rPr>
+                <w:rStyle w:val="VerbatimChar"/>
+              </w:rPr>
+              <w:t xml:space="preserve">WireAvro</w:t>
+            </w:r>
+            <w:r>
+              <w:t xml:space="preserve"> </w:t>
+            </w:r>
+            <w:r>
+              <w:t xml:space="preserve">mode: NodeEvent published as an Avro single-object payload, subscriber decodes via the registry; JSON default preserved), proven against a real NATS broker via</w:t>
+            </w:r>
+            <w:r>
+              <w:t xml:space="preserve"> </w:t>
+            </w:r>
+            <w:r>
+              <w:rPr>
+                <w:rStyle w:val="VerbatimChar"/>
+              </w:rPr>
+              <w:t xml:space="preserve">brokertest.StartNATS</w:t>
+            </w:r>
+            <w:r>
+              <w:t xml:space="preserve"> </w:t>
+            </w:r>
+            <w:r>
+              <w:t xml:space="preserve">asserting the</w:t>
+            </w:r>
+            <w:r>
+              <w:t xml:space="preserve"> </w:t>
+            </w:r>
+            <w:r>
+              <w:rPr>
+                <w:rStyle w:val="VerbatimChar"/>
+              </w:rPr>
+              <w:t xml:space="preserve">0xC3 0x01</w:t>
+            </w:r>
+            <w:r>
+              <w:t xml:space="preserve"> </w:t>
+            </w:r>
+            <w:r>
+              <w:t xml:space="preserve">marker on the wire (HXC-1626).</w:t>
             </w:r>
           </w:p>
         </w:tc>

</xml_diff>

<commit_message>
docs(docs_chain): sync exports after HXC-1791..1831 (CLAUDE-3 mechanical sync)
Regenerated derived exports (md->docx/html/pdf) for README, CHANGELOG,
FOUNDATION_PACKAGES, DATABASE_SCHEMA, USER_MANUAL, fixed/issues + summaries,
consensus, and gap_audits via 'docs_chain sync --all'. Evidence:
qa-results/docs_chain/20260614T184213Z.

KNOWN pre-existing docs gap (NOT introduced by this work): tracked_docs verify
reports 5 STALE pdfs [arch_pdf archdia_pdf mvp_pdf npbound_pdf ph02arch_pdf] —
architecture/mvp source docs untouched tonight; sync reports in-sync yet verify
disagrees = a surfaced both-dirty conflict docs_chain will not silently merge.
Left for human resolution (zero-risk: not force-overwritten overnight).

Co-Authored-By: Claude Opus 4.8 (1M context) <noreply@anthropic.com>
</commit_message>
<xml_diff>
--- a/docs/export/FOUNDATION_PACKAGES.docx
+++ b/docs/export/FOUNDATION_PACKAGES.docx
@@ -743,6 +743,853 @@
             </w:r>
             <w:r>
               <w:t xml:space="preserve">+ partition-leader assignment via a controller quorum, with controller election and controller-loss failover.</w:t>
+            </w:r>
+          </w:p>
+        </w:tc>
+      </w:tr>
+      <w:tr>
+        <w:tc>
+          <w:tcPr/>
+          <w:p>
+            <w:pPr>
+              <w:pStyle w:val="Compact"/>
+            </w:pPr>
+            <w:r>
+              <w:rPr>
+                <w:rStyle w:val="VerbatimChar"/>
+              </w:rPr>
+              <w:t xml:space="preserve">raft</w:t>
+            </w:r>
+          </w:p>
+        </w:tc>
+        <w:tc>
+          <w:tcPr/>
+          <w:p>
+            <w:pPr>
+              <w:pStyle w:val="Compact"/>
+            </w:pPr>
+            <w:r>
+              <w:t xml:space="preserve">Embedded</w:t>
+            </w:r>
+            <w:r>
+              <w:t xml:space="preserve"> </w:t>
+            </w:r>
+            <w:r>
+              <w:rPr>
+                <w:rStyle w:val="VerbatimChar"/>
+              </w:rPr>
+              <w:t xml:space="preserve">github.com/hashicorp/raft</w:t>
+            </w:r>
+            <w:r>
+              <w:t xml:space="preserve"> </w:t>
+            </w:r>
+            <w:r>
+              <w:t xml:space="preserve">consensus: a</w:t>
+            </w:r>
+            <w:r>
+              <w:t xml:space="preserve"> </w:t>
+            </w:r>
+            <w:r>
+              <w:rPr>
+                <w:rStyle w:val="VerbatimChar"/>
+              </w:rPr>
+              <w:t xml:space="preserve">KVFSM</w:t>
+            </w:r>
+            <w:r>
+              <w:t xml:space="preserve"> </w:t>
+            </w:r>
+            <w:r>
+              <w:t xml:space="preserve">replicated key/value state machine (</w:t>
+            </w:r>
+            <w:r>
+              <w:rPr>
+                <w:rStyle w:val="VerbatimChar"/>
+              </w:rPr>
+              <w:t xml:space="preserve">Apply</w:t>
+            </w:r>
+            <w:r>
+              <w:t xml:space="preserve">/</w:t>
+            </w:r>
+            <w:r>
+              <w:rPr>
+                <w:rStyle w:val="VerbatimChar"/>
+              </w:rPr>
+              <w:t xml:space="preserve">Snapshot</w:t>
+            </w:r>
+            <w:r>
+              <w:t xml:space="preserve">/</w:t>
+            </w:r>
+            <w:r>
+              <w:rPr>
+                <w:rStyle w:val="VerbatimChar"/>
+              </w:rPr>
+              <w:t xml:space="preserve">Restore</w:t>
+            </w:r>
+            <w:r>
+              <w:t xml:space="preserve">), a</w:t>
+            </w:r>
+            <w:r>
+              <w:t xml:space="preserve"> </w:t>
+            </w:r>
+            <w:r>
+              <w:rPr>
+                <w:rStyle w:val="VerbatimChar"/>
+              </w:rPr>
+              <w:t xml:space="preserve">Node</w:t>
+            </w:r>
+            <w:r>
+              <w:t xml:space="preserve"> </w:t>
+            </w:r>
+            <w:r>
+              <w:t xml:space="preserve">wrapper (</w:t>
+            </w:r>
+            <w:r>
+              <w:rPr>
+                <w:rStyle w:val="VerbatimChar"/>
+              </w:rPr>
+              <w:t xml:space="preserve">Apply</w:t>
+            </w:r>
+            <w:r>
+              <w:t xml:space="preserve">/</w:t>
+            </w:r>
+            <w:r>
+              <w:rPr>
+                <w:rStyle w:val="VerbatimChar"/>
+              </w:rPr>
+              <w:t xml:space="preserve">Leader</w:t>
+            </w:r>
+            <w:r>
+              <w:t xml:space="preserve">/</w:t>
+            </w:r>
+            <w:r>
+              <w:rPr>
+                <w:rStyle w:val="VerbatimChar"/>
+              </w:rPr>
+              <w:t xml:space="preserve">IsLeader</w:t>
+            </w:r>
+            <w:r>
+              <w:t xml:space="preserve">/</w:t>
+            </w:r>
+            <w:r>
+              <w:rPr>
+                <w:rStyle w:val="VerbatimChar"/>
+              </w:rPr>
+              <w:t xml:space="preserve">State</w:t>
+            </w:r>
+            <w:r>
+              <w:t xml:space="preserve">/</w:t>
+            </w:r>
+            <w:r>
+              <w:rPr>
+                <w:rStyle w:val="VerbatimChar"/>
+              </w:rPr>
+              <w:t xml:space="preserve">Shutdown</w:t>
+            </w:r>
+            <w:r>
+              <w:t xml:space="preserve">) and</w:t>
+            </w:r>
+            <w:r>
+              <w:t xml:space="preserve"> </w:t>
+            </w:r>
+            <w:r>
+              <w:rPr>
+                <w:rStyle w:val="VerbatimChar"/>
+              </w:rPr>
+              <w:t xml:space="preserve">NewInmemCluster</w:t>
+            </w:r>
+            <w:r>
+              <w:t xml:space="preserve"> </w:t>
+            </w:r>
+            <w:r>
+              <w:t xml:space="preserve">for N-node bootstrap over hashicorp/raft’s in-memory transport+store. Real 3-node kill-the-leader integration test: a new leader is elected and committed log entries stay intact on survivors,</w:t>
+            </w:r>
+            <w:r>
+              <w:t xml:space="preserve"> </w:t>
+            </w:r>
+            <w:r>
+              <w:rPr>
+                <w:rStyle w:val="VerbatimChar"/>
+              </w:rPr>
+              <w:t xml:space="preserve">-race</w:t>
+            </w:r>
+            <w:r>
+              <w:t xml:space="preserve"> </w:t>
+            </w:r>
+            <w:r>
+              <w:t xml:space="preserve">clean and non-flaky (HXC-1216). Beyond the in-mem path, three production primitives over the same</w:t>
+            </w:r>
+            <w:r>
+              <w:t xml:space="preserve"> </w:t>
+            </w:r>
+            <w:r>
+              <w:rPr>
+                <w:rStyle w:val="VerbatimChar"/>
+              </w:rPr>
+              <w:t xml:space="preserve">KVFSM</w:t>
+            </w:r>
+            <w:r>
+              <w:t xml:space="preserve">/</w:t>
+            </w:r>
+            <w:r>
+              <w:rPr>
+                <w:rStyle w:val="VerbatimChar"/>
+              </w:rPr>
+              <w:t xml:space="preserve">Node</w:t>
+            </w:r>
+            <w:r>
+              <w:t xml:space="preserve">/</w:t>
+            </w:r>
+            <w:r>
+              <w:rPr>
+                <w:rStyle w:val="VerbatimChar"/>
+              </w:rPr>
+              <w:t xml:space="preserve">Cluster</w:t>
+            </w:r>
+            <w:r>
+              <w:t xml:space="preserve"> </w:t>
+            </w:r>
+            <w:r>
+              <w:t xml:space="preserve">contract: (1) a real TCP</w:t>
+            </w:r>
+            <w:r>
+              <w:t xml:space="preserve"> </w:t>
+            </w:r>
+            <w:r>
+              <w:rPr>
+                <w:b/>
+                <w:bCs/>
+              </w:rPr>
+              <w:t xml:space="preserve">network</w:t>
+            </w:r>
+            <w:r>
+              <w:t xml:space="preserve"> </w:t>
+            </w:r>
+            <w:r>
+              <w:t xml:space="preserve">transport (</w:t>
+            </w:r>
+            <w:r>
+              <w:rPr>
+                <w:rStyle w:val="VerbatimChar"/>
+              </w:rPr>
+              <w:t xml:space="preserve">tcp.go</w:t>
+            </w:r>
+            <w:r>
+              <w:t xml:space="preserve">) —</w:t>
+            </w:r>
+            <w:r>
+              <w:t xml:space="preserve"> </w:t>
+            </w:r>
+            <w:r>
+              <w:rPr>
+                <w:rStyle w:val="VerbatimChar"/>
+              </w:rPr>
+              <w:t xml:space="preserve">tcpStreamLayer</w:t>
+            </w:r>
+            <w:r>
+              <w:t xml:space="preserve"> </w:t>
+            </w:r>
+            <w:r>
+              <w:t xml:space="preserve">over</w:t>
+            </w:r>
+            <w:r>
+              <w:t xml:space="preserve"> </w:t>
+            </w:r>
+            <w:r>
+              <w:rPr>
+                <w:rStyle w:val="VerbatimChar"/>
+              </w:rPr>
+              <w:t xml:space="preserve">net.ListenTCP</w:t>
+            </w:r>
+            <w:r>
+              <w:t xml:space="preserve"> </w:t>
+            </w:r>
+            <w:r>
+              <w:t xml:space="preserve">(loopback ephemeral port) wrapped in</w:t>
+            </w:r>
+            <w:r>
+              <w:t xml:space="preserve"> </w:t>
+            </w:r>
+            <w:r>
+              <w:rPr>
+                <w:rStyle w:val="VerbatimChar"/>
+              </w:rPr>
+              <w:t xml:space="preserve">raft.NewNetworkTransportWithConfig</w:t>
+            </w:r>
+            <w:r>
+              <w:t xml:space="preserve">, with</w:t>
+            </w:r>
+            <w:r>
+              <w:t xml:space="preserve"> </w:t>
+            </w:r>
+            <w:r>
+              <w:rPr>
+                <w:rStyle w:val="VerbatimChar"/>
+              </w:rPr>
+              <w:t xml:space="preserve">NewNetworkCluster(ids...)</w:t>
+            </w:r>
+            <w:r>
+              <w:t xml:space="preserve"> </w:t>
+            </w:r>
+            <w:r>
+              <w:t xml:space="preserve">standing up an N-node cluster whose RequestVote/AppendEntries/InstallSnapshot RPCs travel over genuine kernel sockets (leak-safe partial-failure cleanup;</w:t>
+            </w:r>
+            <w:r>
+              <w:t xml:space="preserve"> </w:t>
+            </w:r>
+            <w:r>
+              <w:rPr>
+                <w:rStyle w:val="VerbatimChar"/>
+              </w:rPr>
+              <w:t xml:space="preserve">NetTransport</w:t>
+            </w:r>
+            <w:r>
+              <w:t xml:space="preserve">/</w:t>
+            </w:r>
+            <w:r>
+              <w:rPr>
+                <w:rStyle w:val="VerbatimChar"/>
+              </w:rPr>
+              <w:t xml:space="preserve">LocalTCPAddr</w:t>
+            </w:r>
+            <w:r>
+              <w:t xml:space="preserve"> </w:t>
+            </w:r>
+            <w:r>
+              <w:t xml:space="preserve">accessors), stores still in-mem (HXC-974); (2) real on-disk</w:t>
+            </w:r>
+            <w:r>
+              <w:t xml:space="preserve"> </w:t>
+            </w:r>
+            <w:r>
+              <w:rPr>
+                <w:b/>
+                <w:bCs/>
+              </w:rPr>
+              <w:t xml:space="preserve">persistence</w:t>
+            </w:r>
+            <w:r>
+              <w:t xml:space="preserve"> </w:t>
+            </w:r>
+            <w:r>
+              <w:t xml:space="preserve">(</w:t>
+            </w:r>
+            <w:r>
+              <w:rPr>
+                <w:rStyle w:val="VerbatimChar"/>
+              </w:rPr>
+              <w:t xml:space="preserve">store.go</w:t>
+            </w:r>
+            <w:r>
+              <w:t xml:space="preserve">) —</w:t>
+            </w:r>
+            <w:r>
+              <w:t xml:space="preserve"> </w:t>
+            </w:r>
+            <w:r>
+              <w:rPr>
+                <w:rStyle w:val="VerbatimChar"/>
+              </w:rPr>
+              <w:t xml:space="preserve">NewPersistentNode(id,dataDir)</w:t>
+            </w:r>
+            <w:r>
+              <w:t xml:space="preserve"> </w:t>
+            </w:r>
+            <w:r>
+              <w:t xml:space="preserve">backed by a</w:t>
+            </w:r>
+            <w:r>
+              <w:t xml:space="preserve"> </w:t>
+            </w:r>
+            <w:r>
+              <w:rPr>
+                <w:rStyle w:val="VerbatimChar"/>
+              </w:rPr>
+              <w:t xml:space="preserve">hashicorp/raft-boltdb/v2</w:t>
+            </w:r>
+            <w:r>
+              <w:t xml:space="preserve"> </w:t>
+            </w:r>
+            <w:r>
+              <w:rPr>
+                <w:rStyle w:val="VerbatimChar"/>
+              </w:rPr>
+              <w:t xml:space="preserve">BoltStore</w:t>
+            </w:r>
+            <w:r>
+              <w:t xml:space="preserve"> </w:t>
+            </w:r>
+            <w:r>
+              <w:t xml:space="preserve">(one bbolt file as log+stable store) plus a</w:t>
+            </w:r>
+            <w:r>
+              <w:t xml:space="preserve"> </w:t>
+            </w:r>
+            <w:r>
+              <w:rPr>
+                <w:rStyle w:val="VerbatimChar"/>
+              </w:rPr>
+              <w:t xml:space="preserve">FileSnapshotStore</w:t>
+            </w:r>
+            <w:r>
+              <w:t xml:space="preserve">, so a Shutdown→re-open of the same dir recovers all committed entries from disk WITHOUT caller re-apply (reopen detected → no re-bootstrap;</w:t>
+            </w:r>
+            <w:r>
+              <w:t xml:space="preserve"> </w:t>
+            </w:r>
+            <w:r>
+              <w:rPr>
+                <w:rStyle w:val="VerbatimChar"/>
+              </w:rPr>
+              <w:t xml:space="preserve">WaitForLeader</w:t>
+            </w:r>
+            <w:r>
+              <w:t xml:space="preserve"> </w:t>
+            </w:r>
+            <w:r>
+              <w:t xml:space="preserve">issues a</w:t>
+            </w:r>
+            <w:r>
+              <w:t xml:space="preserve"> </w:t>
+            </w:r>
+            <w:r>
+              <w:rPr>
+                <w:rStyle w:val="VerbatimChar"/>
+              </w:rPr>
+              <w:t xml:space="preserve">Barrier</w:t>
+            </w:r>
+            <w:r>
+              <w:t xml:space="preserve"> </w:t>
+            </w:r>
+            <w:r>
+              <w:t xml:space="preserve">so recovery is fully applied before return), in-mem transport (HXC-976); (3) a combined</w:t>
+            </w:r>
+            <w:r>
+              <w:t xml:space="preserve"> </w:t>
+            </w:r>
+            <w:r>
+              <w:rPr>
+                <w:b/>
+                <w:bCs/>
+              </w:rPr>
+              <w:t xml:space="preserve">persistent+networked</w:t>
+            </w:r>
+            <w:r>
+              <w:t xml:space="preserve"> </w:t>
+            </w:r>
+            <w:r>
+              <w:t xml:space="preserve">production node (</w:t>
+            </w:r>
+            <w:r>
+              <w:rPr>
+                <w:rStyle w:val="VerbatimChar"/>
+              </w:rPr>
+              <w:t xml:space="preserve">persistnet.go</w:t>
+            </w:r>
+            <w:r>
+              <w:t xml:space="preserve">) —</w:t>
+            </w:r>
+            <w:r>
+              <w:t xml:space="preserve"> </w:t>
+            </w:r>
+            <w:r>
+              <w:rPr>
+                <w:rStyle w:val="VerbatimChar"/>
+              </w:rPr>
+              <w:t xml:space="preserve">NewPersistentNetworkNode</w:t>
+            </w:r>
+            <w:r>
+              <w:t xml:space="preserve"> </w:t>
+            </w:r>
+            <w:r>
+              <w:t xml:space="preserve">/</w:t>
+            </w:r>
+            <w:r>
+              <w:t xml:space="preserve"> </w:t>
+            </w:r>
+            <w:r>
+              <w:rPr>
+                <w:rStyle w:val="VerbatimChar"/>
+              </w:rPr>
+              <w:t xml:space="preserve">NewPersistentNetworkCluster(ids,dataDirs)</w:t>
+            </w:r>
+            <w:r>
+              <w:t xml:space="preserve"> </w:t>
+            </w:r>
+            <w:r>
+              <w:t xml:space="preserve">composing the real TCP transport AND the real BoltDB+snapshot persistence into one node (restart→recover-from-disk→rejoin over a freshly bound port), reusing</w:t>
+            </w:r>
+            <w:r>
+              <w:t xml:space="preserve"> </w:t>
+            </w:r>
+            <w:r>
+              <w:rPr>
+                <w:rStyle w:val="VerbatimChar"/>
+              </w:rPr>
+              <w:t xml:space="preserve">openTCPTransport</w:t>
+            </w:r>
+            <w:r>
+              <w:t xml:space="preserve">/</w:t>
+            </w:r>
+            <w:r>
+              <w:rPr>
+                <w:rStyle w:val="VerbatimChar"/>
+              </w:rPr>
+              <w:t xml:space="preserve">openPersistentStores</w:t>
+            </w:r>
+            <w:r>
+              <w:t xml:space="preserve"> </w:t>
+            </w:r>
+            <w:r>
+              <w:t xml:space="preserve">so the two halves can’t drift (Task I5). For multi-</w:t>
+            </w:r>
+            <w:r>
+              <w:rPr>
+                <w:b/>
+                <w:bCs/>
+              </w:rPr>
+              <w:t xml:space="preserve">process</w:t>
+            </w:r>
+            <w:r>
+              <w:t xml:space="preserve"> </w:t>
+            </w:r>
+            <w:r>
+              <w:t xml:space="preserve">clusters,</w:t>
+            </w:r>
+            <w:r>
+              <w:t xml:space="preserve"> </w:t>
+            </w:r>
+            <w:r>
+              <w:rPr>
+                <w:rStyle w:val="VerbatimChar"/>
+              </w:rPr>
+              <w:t xml:space="preserve">NewPersistentNetworkNodeAt(id,dataDir,bindAddr,base,servers)</w:t>
+            </w:r>
+            <w:r>
+              <w:t xml:space="preserve"> </w:t>
+            </w:r>
+            <w:r>
+              <w:t xml:space="preserve">binds a caller-specified fixed TCP address with an explicit server set (first boot bootstraps; reopen recovers-from-disk without re-bootstrap), via the single shared</w:t>
+            </w:r>
+            <w:r>
+              <w:t xml:space="preserve"> </w:t>
+            </w:r>
+            <w:r>
+              <w:rPr>
+                <w:rStyle w:val="VerbatimChar"/>
+              </w:rPr>
+              <w:t xml:space="preserve">openTCPTransportAt</w:t>
+            </w:r>
+            <w:r>
+              <w:t xml:space="preserve"> </w:t>
+            </w:r>
+            <w:r>
+              <w:t xml:space="preserve">(no TCP-wiring duplication). This primitive backs the</w:t>
+            </w:r>
+            <w:r>
+              <w:t xml:space="preserve"> </w:t>
+            </w:r>
+            <w:r>
+              <w:rPr>
+                <w:rStyle w:val="VerbatimChar"/>
+              </w:rPr>
+              <w:t xml:space="preserve">helix-raftd</w:t>
+            </w:r>
+            <w:r>
+              <w:t xml:space="preserve"> </w:t>
+            </w:r>
+            <w:r>
+              <w:t xml:space="preserve">daemon (</w:t>
+            </w:r>
+            <w:r>
+              <w:rPr>
+                <w:rStyle w:val="VerbatimChar"/>
+              </w:rPr>
+              <w:t xml:space="preserve">cmd/helix-raftd</w:t>
+            </w:r>
+            <w:r>
+              <w:t xml:space="preserve">): one persistent+networked node per OS process with an HTTP admin API (</w:t>
+            </w:r>
+            <w:r>
+              <w:rPr>
+                <w:rStyle w:val="VerbatimChar"/>
+              </w:rPr>
+              <w:t xml:space="preserve">/status</w:t>
+            </w:r>
+            <w:r>
+              <w:t xml:space="preserve">,</w:t>
+            </w:r>
+            <w:r>
+              <w:t xml:space="preserve"> </w:t>
+            </w:r>
+            <w:r>
+              <w:rPr>
+                <w:rStyle w:val="VerbatimChar"/>
+              </w:rPr>
+              <w:t xml:space="preserve">/get</w:t>
+            </w:r>
+            <w:r>
+              <w:t xml:space="preserve">, leader-only</w:t>
+            </w:r>
+            <w:r>
+              <w:t xml:space="preserve"> </w:t>
+            </w:r>
+            <w:r>
+              <w:rPr>
+                <w:rStyle w:val="VerbatimChar"/>
+              </w:rPr>
+              <w:t xml:space="preserve">/put</w:t>
+            </w:r>
+            <w:r>
+              <w:t xml:space="preserve"> </w:t>
+            </w:r>
+            <w:r>
+              <w:t xml:space="preserve">via raft</w:t>
+            </w:r>
+            <w:r>
+              <w:t xml:space="preserve"> </w:t>
+            </w:r>
+            <w:r>
+              <w:rPr>
+                <w:rStyle w:val="VerbatimChar"/>
+              </w:rPr>
+              <w:t xml:space="preserve">Apply</w:t>
+            </w:r>
+            <w:r>
+              <w:t xml:space="preserve"> </w:t>
+            </w:r>
+            <w:r>
+              <w:t xml:space="preserve">— a follower returns 421 + the real leader address, so no split-brain), proven by a real 3-process E2E that survives a leader-process</w:t>
+            </w:r>
+            <w:r>
+              <w:t xml:space="preserve"> </w:t>
+            </w:r>
+            <w:r>
+              <w:rPr>
+                <w:rStyle w:val="VerbatimChar"/>
+              </w:rPr>
+              <w:t xml:space="preserve">SIGKILL</w:t>
+            </w:r>
+            <w:r>
+              <w:t xml:space="preserve"> </w:t>
+            </w:r>
+            <w:r>
+              <w:t xml:space="preserve">and a full-cluster restart-from-disk where every value re-served could only have come from on-disk BoltDB (HXC-982).</w:t>
+            </w:r>
+          </w:p>
+        </w:tc>
+      </w:tr>
+      <w:tr>
+        <w:tc>
+          <w:tcPr/>
+          <w:p>
+            <w:pPr>
+              <w:pStyle w:val="Compact"/>
+            </w:pPr>
+            <w:r>
+              <w:rPr>
+                <w:rStyle w:val="VerbatimChar"/>
+              </w:rPr>
+              <w:t xml:space="preserve">raftleader</w:t>
+            </w:r>
+          </w:p>
+        </w:tc>
+        <w:tc>
+          <w:tcPr/>
+          <w:p>
+            <w:pPr>
+              <w:pStyle w:val="Compact"/>
+            </w:pPr>
+            <w:r>
+              <w:t xml:space="preserve">Real Raft-backed leader-election service adapting</w:t>
+            </w:r>
+            <w:r>
+              <w:t xml:space="preserve"> </w:t>
+            </w:r>
+            <w:r>
+              <w:rPr>
+                <w:rStyle w:val="VerbatimChar"/>
+              </w:rPr>
+              <w:t xml:space="preserve">raft</w:t>
+            </w:r>
+            <w:r>
+              <w:t xml:space="preserve"> </w:t>
+            </w:r>
+            <w:r>
+              <w:t xml:space="preserve">to a</w:t>
+            </w:r>
+            <w:r>
+              <w:t xml:space="preserve"> </w:t>
+            </w:r>
+            <w:r>
+              <w:rPr>
+                <w:rStyle w:val="VerbatimChar"/>
+              </w:rPr>
+              <w:t xml:space="preserve">leader</w:t>
+            </w:r>
+            <w:r>
+              <w:t xml:space="preserve">-shaped contract:</w:t>
+            </w:r>
+            <w:r>
+              <w:t xml:space="preserve"> </w:t>
+            </w:r>
+            <w:r>
+              <w:rPr>
+                <w:rStyle w:val="VerbatimChar"/>
+              </w:rPr>
+              <w:t xml:space="preserve">RaftElection</w:t>
+            </w:r>
+            <w:r>
+              <w:t xml:space="preserve"> </w:t>
+            </w:r>
+            <w:r>
+              <w:t xml:space="preserve">(</w:t>
+            </w:r>
+            <w:r>
+              <w:rPr>
+                <w:rStyle w:val="VerbatimChar"/>
+              </w:rPr>
+              <w:t xml:space="preserve">IsLeader</w:t>
+            </w:r>
+            <w:r>
+              <w:t xml:space="preserve">/</w:t>
+            </w:r>
+            <w:r>
+              <w:rPr>
+                <w:rStyle w:val="VerbatimChar"/>
+              </w:rPr>
+              <w:t xml:space="preserve">LeaderID</w:t>
+            </w:r>
+            <w:r>
+              <w:t xml:space="preserve">/</w:t>
+            </w:r>
+            <w:r>
+              <w:rPr>
+                <w:rStyle w:val="VerbatimChar"/>
+              </w:rPr>
+              <w:t xml:space="preserve">Resign</w:t>
+            </w:r>
+            <w:r>
+              <w:t xml:space="preserve"> </w:t>
+            </w:r>
+            <w:r>
+              <w:t xml:space="preserve">via a real</w:t>
+            </w:r>
+            <w:r>
+              <w:t xml:space="preserve"> </w:t>
+            </w:r>
+            <w:r>
+              <w:rPr>
+                <w:rStyle w:val="VerbatimChar"/>
+              </w:rPr>
+              <w:t xml:space="preserve">LeadershipTransfer</w:t>
+            </w:r>
+            <w:r>
+              <w:t xml:space="preserve">,</w:t>
+            </w:r>
+            <w:r>
+              <w:t xml:space="preserve"> </w:t>
+            </w:r>
+            <w:r>
+              <w:rPr>
+                <w:rStyle w:val="VerbatimChar"/>
+              </w:rPr>
+              <w:t xml:space="preserve">Apply</w:t>
+            </w:r>
+            <w:r>
+              <w:t xml:space="preserve"> </w:t>
+            </w:r>
+            <w:r>
+              <w:t xml:space="preserve">leader-gated,</w:t>
+            </w:r>
+            <w:r>
+              <w:t xml:space="preserve"> </w:t>
+            </w:r>
+            <w:r>
+              <w:rPr>
+                <w:rStyle w:val="VerbatimChar"/>
+              </w:rPr>
+              <w:t xml:space="preserve">Campaign</w:t>
+            </w:r>
+            <w:r>
+              <w:t xml:space="preserve">/</w:t>
+            </w:r>
+            <w:r>
+              <w:rPr>
+                <w:rStyle w:val="VerbatimChar"/>
+              </w:rPr>
+              <w:t xml:space="preserve">WaitForLeadership</w:t>
+            </w:r>
+            <w:r>
+              <w:t xml:space="preserve">,</w:t>
+            </w:r>
+            <w:r>
+              <w:t xml:space="preserve"> </w:t>
+            </w:r>
+            <w:r>
+              <w:rPr>
+                <w:rStyle w:val="VerbatimChar"/>
+              </w:rPr>
+              <w:t xml:space="preserve">LeadershipChanges</w:t>
+            </w:r>
+            <w:r>
+              <w:t xml:space="preserve"> </w:t>
+            </w:r>
+            <w:r>
+              <w:t xml:space="preserve">sourced from hashicorp/raft’s</w:t>
+            </w:r>
+            <w:r>
+              <w:t xml:space="preserve"> </w:t>
+            </w:r>
+            <w:r>
+              <w:rPr>
+                <w:rStyle w:val="VerbatimChar"/>
+              </w:rPr>
+              <w:t xml:space="preserve">LeaderCh</w:t>
+            </w:r>
+            <w:r>
+              <w:t xml:space="preserve">,</w:t>
+            </w:r>
+            <w:r>
+              <w:t xml:space="preserve"> </w:t>
+            </w:r>
+            <w:r>
+              <w:rPr>
+                <w:rStyle w:val="VerbatimChar"/>
+              </w:rPr>
+              <w:t xml:space="preserve">ErrNotLeader</w:t>
+            </w:r>
+            <w:r>
+              <w:t xml:space="preserve">). 3-node test: exactly-one-leader, follower write-gating, kill-leader re-election, committed state survives failover (HXC-953). Closes the gap where</w:t>
+            </w:r>
+            <w:r>
+              <w:t xml:space="preserve"> </w:t>
+            </w:r>
+            <w:r>
+              <w:rPr>
+                <w:rStyle w:val="VerbatimChar"/>
+              </w:rPr>
+              <w:t xml:space="preserve">leader</w:t>
+            </w:r>
+            <w:r>
+              <w:t xml:space="preserve"> </w:t>
+            </w:r>
+            <w:r>
+              <w:t xml:space="preserve">was not real Raft;</w:t>
+            </w:r>
+            <w:r>
+              <w:t xml:space="preserve"> </w:t>
+            </w:r>
+            <w:r>
+              <w:rPr>
+                <w:rStyle w:val="VerbatimChar"/>
+              </w:rPr>
+              <w:t xml:space="preserve">leader</w:t>
+            </w:r>
+            <w:r>
+              <w:t xml:space="preserve"> </w:t>
+            </w:r>
+            <w:r>
+              <w:t xml:space="preserve">left untouched.</w:t>
             </w:r>
           </w:p>
         </w:tc>

</xml_diff>